<commit_message>
relate projects to the experiences
</commit_message>
<xml_diff>
--- a/resume.docx
+++ b/resume.docx
@@ -35,7 +35,7 @@
     </w:p>
     <w:p>
       <w:r>
-        <w:t>An Applied AI Engineer specializing in LLM and agentic systems, with a proven track record of transforming data into actionable decisions. Possesses expertise in building procurement and business-intelligence agents on Google ADK, designing RAG pipelines with source-cited outputs, and deploying end-to-end solutions on GCP following GitOps principles. Demonstrates a strong capability in owning full product lifecycles, from architecture through deployment and monitoring.</w:t>
+        <w:t>An Applied AI Engineer specializing in LLM and agentic systems, adept at transforming data into critical business decisions. Possesses expertise in architecting and deploying autonomous procurement agents on Google ADK, designing RAG pipelines with source-cited outputs, and building robust FastAPI microservices on GCP. Comfortable owning the full product lifecycle from architecture through deployment and monitoring, ensuring scalable and impactful AI solutions.</w:t>
       </w:r>
     </w:p>
     <w:p>
@@ -70,7 +70,7 @@
         <w:pStyle w:val="ListBullet"/>
       </w:pPr>
       <w:r>
-        <w:t>Architecting and building autonomous procurement analytics agents on Google ADK, enabling data-driven sourcing decisions across the full procurement lifecycle and aligning with agentic systems domain.</w:t>
+        <w:t>Architected and built AI-powered procurement agents on Google ADK using Vertex AI Agent Engine and GCP, enabling data-driven sourcing decisions across the full procurement lifecycle and leveraging Model Context Protocol (MCP) for advanced agent interactions.</w:t>
       </w:r>
     </w:p>
     <w:p>
@@ -78,7 +78,15 @@
         <w:pStyle w:val="ListBullet"/>
       </w:pPr>
       <w:r>
-        <w:t>Designing and implementing RAG pipelines with source-cited outputs to surface critical supplier insights from unstructured documents, enhancing AI capabilities.</w:t>
+        <w:t>Designed and implemented RAG pipelines with source-cited outputs to surface critical supplier insights from unstructured documents, ensuring data integrity and explainability.</w:t>
+      </w:r>
+    </w:p>
+    <w:p>
+      <w:pPr>
+        <w:pStyle w:val="ListBullet"/>
+      </w:pPr>
+      <w:r>
+        <w:t>Utilized Terraform for infrastructure provisioning and deployed FastAPI microservices on Google Cloud Run, integrating with BigQuery and Google Cloud Storage, while managing database schema versioning with Alembic.</w:t>
       </w:r>
     </w:p>
     <w:p>
@@ -97,7 +105,7 @@
         <w:pStyle w:val="ListBullet"/>
       </w:pPr>
       <w:r>
-        <w:t>Owned the end-to-end development of an AI-enabled M&amp;A CRM, covering the full deal lifecycle and demonstrating expertise in agentic systems and full product ownership.</w:t>
+        <w:t>Spearheaded the end-to-end development of an AI-enabled M&amp;A CRM as the sole developer, encompassing the full deal lifecycle from lead ingestion to automated closing workflows on GCP.</w:t>
       </w:r>
     </w:p>
     <w:p>
@@ -105,7 +113,7 @@
         <w:pStyle w:val="ListBullet"/>
       </w:pPr>
       <w:r>
-        <w:t>Reduced manual review effort by ~80% through LLM-powered document analysis, entity extraction, and automated deal-stage classification, showcasing strong AI capabilities.</w:t>
+        <w:t>Reduced manual review effort by approximately 80% through the implementation of LLM-powered document analysis and entity extraction using Langchain and Gemini 2.5 Flash Lite.</w:t>
       </w:r>
     </w:p>
     <w:p>
@@ -113,7 +121,7 @@
         <w:pStyle w:val="ListBullet"/>
       </w:pPr>
       <w:r>
-        <w:t>Built and deployed FastAPI services on GCP, integrating PostgreSQL and Streamlit, showcasing proficiency in GCP and modern development practices, including principles relevant to GitOps.</w:t>
+        <w:t>Developed and deployed robust FastAPI services on GCP, integrating PostgreSQL and Streamlit dashboards for user interaction, alongside designing a Question Answering RAG Chat Agent with an Agentic Workflow for contextual information retrieval and source citation.</w:t>
       </w:r>
     </w:p>
     <w:p>
@@ -122,70 +130,6 @@
       </w:pPr>
       <w:r>
         <w:t>Projects</w:t>
-      </w:r>
-    </w:p>
-    <w:p>
-      <w:r>
-        <w:rPr>
-          <w:b/>
-        </w:rPr>
-        <w:t>cat-ai-proc-agent: AI Agent Backend for Procurement</w:t>
-      </w:r>
-    </w:p>
-    <w:p>
-      <w:pPr>
-        <w:pStyle w:val="ListBullet"/>
-      </w:pPr>
-      <w:r>
-        <w:t>Architected and managed AI Agent orchestration, leveraging Google ADK to facilitate data-driven procurement decisions within an autonomous agent ecosystem.</w:t>
-      </w:r>
-    </w:p>
-    <w:p>
-      <w:pPr>
-        <w:pStyle w:val="ListBullet"/>
-      </w:pPr>
-      <w:r>
-        <w:t>Implemented Infrastructure as Code (Terraform) on Google Cloud Platform (GCP), adhering to GitOps principles for scalable and secure deployments.</w:t>
-      </w:r>
-    </w:p>
-    <w:p>
-      <w:pPr>
-        <w:pStyle w:val="ListBullet"/>
-      </w:pPr>
-      <w:r>
-        <w:t>Developed FastAPI microservices and integrated Google GenAI for LLM prompt engineering and real-time data analysis, enhancing AI capabilities.</w:t>
-      </w:r>
-    </w:p>
-    <w:p>
-      <w:r>
-        <w:rPr>
-          <w:b/>
-        </w:rPr>
-        <w:t>Question-Answering-RAG-Chat-Agent: RAG-based Question Answering System</w:t>
-      </w:r>
-    </w:p>
-    <w:p>
-      <w:pPr>
-        <w:pStyle w:val="ListBullet"/>
-      </w:pPr>
-      <w:r>
-        <w:t>Developed an LLM Agent for a RAG-based Question Answering System, enabling contextual responses from unstructured documents within an agentic system.</w:t>
-      </w:r>
-    </w:p>
-    <w:p>
-      <w:pPr>
-        <w:pStyle w:val="ListBullet"/>
-      </w:pPr>
-      <w:r>
-        <w:t>Designed and implemented RAG pipelines for document ingestion, chunking, and vector storage, enhancing AI capabilities for information retrieval.</w:t>
-      </w:r>
-    </w:p>
-    <w:p>
-      <w:pPr>
-        <w:pStyle w:val="ListBullet"/>
-      </w:pPr>
-      <w:r>
-        <w:t>Deployed FastAPI services utilizing Google GenAI for advanced conversational AI and real-time streaming responses.</w:t>
       </w:r>
     </w:p>
     <w:p>

</xml_diff>